<commit_message>
learnt basics of solidity and crash course of django
</commit_message>
<xml_diff>
--- a/Projects/onlineauction/Synopsis.docx
+++ b/Projects/onlineauction/Synopsis.docx
@@ -759,7 +759,7 @@
           <w:szCs w:val="32"/>
           <w:lang w:val="en-IN"/>
         </w:rPr>
-        <w:t>ABESIT INSTITUTE OF TECHNOLOGY GHAZIABAD</w:t>
+        <w:t>ABES INSTITUTE OF TECHNOLOGY GHAZIABAD</w:t>
       </w:r>
     </w:p>
     <w:p>
@@ -4800,6 +4800,9 @@
         <w:jc w:val="right"/>
       </w:pPr>
       <w:r>
+        <w:rPr>
+          <w:noProof/>
+        </w:rPr>
         <w:drawing>
           <wp:inline distT="0" distB="0" distL="0" distR="0" wp14:anchorId="5237DC85" wp14:editId="213AFC13">
             <wp:extent cx="6479408" cy="3188677"/>
@@ -4858,6 +4861,9 @@
         <w:jc w:val="right"/>
       </w:pPr>
       <w:r>
+        <w:rPr>
+          <w:noProof/>
+        </w:rPr>
         <w:drawing>
           <wp:inline distT="0" distB="0" distL="0" distR="0" wp14:anchorId="664F70C5" wp14:editId="2826FDCD">
             <wp:extent cx="6478905" cy="2905523"/>
@@ -9512,6 +9518,10 @@
 </file>
 
 <file path=customXml/item1.xml><?xml version="1.0" encoding="utf-8"?>
+<b:Sources xmlns:b="http://schemas.openxmlformats.org/officeDocument/2006/bibliography" xmlns="http://schemas.openxmlformats.org/officeDocument/2006/bibliography" SelectedStyle="\APASixthEditionOfficeOnline.xsl" StyleName="APA" Version="6"/>
+</file>
+
+<file path=customXml/item2.xml><?xml version="1.0" encoding="utf-8"?>
 <s:customData xmlns="http://www.wps.cn/officeDocument/2013/wpsCustomData" xmlns:s="http://www.wps.cn/officeDocument/2013/wpsCustomData">
   <customSectProps>
     <customSectPr/>
@@ -9519,22 +9529,18 @@
 </s:customData>
 </file>
 
-<file path=customXml/item2.xml><?xml version="1.0" encoding="utf-8"?>
-<b:Sources xmlns:b="http://schemas.openxmlformats.org/officeDocument/2006/bibliography" xmlns="http://schemas.openxmlformats.org/officeDocument/2006/bibliography" SelectedStyle="\APASixthEditionOfficeOnline.xsl" StyleName="APA" Version="6"/>
+<file path=customXml/itemProps1.xml><?xml version="1.0" encoding="utf-8"?>
+<ds:datastoreItem xmlns:ds="http://schemas.openxmlformats.org/officeDocument/2006/customXml" ds:itemID="{46AB8830-5772-4B29-AEFC-32371A248D15}">
+  <ds:schemaRefs>
+    <ds:schemaRef ds:uri="http://schemas.openxmlformats.org/officeDocument/2006/bibliography"/>
+  </ds:schemaRefs>
+</ds:datastoreItem>
 </file>
 
-<file path=customXml/itemProps1.xml><?xml version="1.0" encoding="utf-8"?>
+<file path=customXml/itemProps2.xml><?xml version="1.0" encoding="utf-8"?>
 <ds:datastoreItem xmlns:ds="http://schemas.openxmlformats.org/officeDocument/2006/customXml" ds:itemID="{B1977F7D-205B-4081-913C-38D41E755F92}">
   <ds:schemaRefs>
     <ds:schemaRef ds:uri="http://www.wps.cn/officeDocument/2013/wpsCustomData"/>
   </ds:schemaRefs>
 </ds:datastoreItem>
-</file>
-
-<file path=customXml/itemProps2.xml><?xml version="1.0" encoding="utf-8"?>
-<ds:datastoreItem xmlns:ds="http://schemas.openxmlformats.org/officeDocument/2006/customXml" ds:itemID="{46AB8830-5772-4B29-AEFC-32371A248D15}">
-  <ds:schemaRefs>
-    <ds:schemaRef ds:uri="http://schemas.openxmlformats.org/officeDocument/2006/bibliography"/>
-  </ds:schemaRefs>
-</ds:datastoreItem>
 </file>
</xml_diff>